<commit_message>
fix: tanggal di preview
</commit_message>
<xml_diff>
--- a/Berita Acara Alokasi_fix.docx
+++ b/Berita Acara Alokasi_fix.docx
@@ -37,9 +37,17 @@
                 <w:noProof/>
               </w:rPr>
               <w:drawing>
-                <wp:inline distT="0" distB="0" distL="0" distR="0" wp14:anchorId="3CBE1705" wp14:editId="0F43DA6D">
-                  <wp:extent cx="977676" cy="287215"/>
+                <wp:anchor distT="0" distB="0" distL="114300" distR="114300" simplePos="0" relativeHeight="251659264" behindDoc="0" locked="0" layoutInCell="1" allowOverlap="1" wp14:anchorId="27E6B33E" wp14:editId="08023568">
+                  <wp:simplePos x="0" y="0"/>
+                  <wp:positionH relativeFrom="column">
+                    <wp:posOffset>-178045</wp:posOffset>
+                  </wp:positionH>
+                  <wp:positionV relativeFrom="paragraph">
+                    <wp:posOffset>-100330</wp:posOffset>
+                  </wp:positionV>
+                  <wp:extent cx="1185756" cy="348343"/>
                   <wp:effectExtent l="0" t="0" r="0" b="0"/>
+                  <wp:wrapNone/>
                   <wp:docPr id="2091714517" name="Picture 1" descr="PT Pertamina Patra Niaga Logo Vector"/>
                   <wp:cNvGraphicFramePr>
                     <a:graphicFrameLocks xmlns:a="http://schemas.openxmlformats.org/drawingml/2006/main" noChangeAspect="1"/>
@@ -69,7 +77,7 @@
                         <pic:spPr bwMode="auto">
                           <a:xfrm>
                             <a:off x="0" y="0"/>
-                            <a:ext cx="1023252" cy="300604"/>
+                            <a:ext cx="1185756" cy="348343"/>
                           </a:xfrm>
                           <a:prstGeom prst="rect">
                             <a:avLst/>
@@ -87,7 +95,13 @@
                       </pic:pic>
                     </a:graphicData>
                   </a:graphic>
-                </wp:inline>
+                  <wp14:sizeRelH relativeFrom="margin">
+                    <wp14:pctWidth>0</wp14:pctWidth>
+                  </wp14:sizeRelH>
+                  <wp14:sizeRelV relativeFrom="margin">
+                    <wp14:pctHeight>0</wp14:pctHeight>
+                  </wp14:sizeRelV>
+                </wp:anchor>
               </w:drawing>
             </w:r>
           </w:p>
@@ -228,7 +242,6 @@
               <w:tblStyle w:val="TableGrid"/>
               <w:tblW w:w="0" w:type="auto"/>
               <w:tblBorders>
-                <w:insideH w:val="none" w:sz="0" w:space="0" w:color="auto"/>
                 <w:insideV w:val="none" w:sz="0" w:space="0" w:color="auto"/>
               </w:tblBorders>
               <w:tblLook w:val="04A0" w:firstRow="1" w:lastRow="0" w:firstColumn="1" w:lastColumn="0" w:noHBand="0" w:noVBand="1"/>
@@ -530,14 +543,14 @@
         <w:tblLook w:val="04A0" w:firstRow="1" w:lastRow="0" w:firstColumn="1" w:lastColumn="0" w:noHBand="0" w:noVBand="1"/>
       </w:tblPr>
       <w:tblGrid>
-        <w:gridCol w:w="2785"/>
+        <w:gridCol w:w="3235"/>
         <w:gridCol w:w="270"/>
-        <w:gridCol w:w="6073"/>
+        <w:gridCol w:w="5623"/>
       </w:tblGrid>
       <w:tr>
         <w:tc>
           <w:tcPr>
-            <w:tcW w:w="2785" w:type="dxa"/>
+            <w:tcW w:w="3235" w:type="dxa"/>
             <w:tcMar>
               <w:top w:w="60" w:type="dxa"/>
               <w:left w:w="80" w:type="dxa"/>
@@ -547,6 +560,7 @@
           </w:tcPr>
           <w:p>
             <w:pPr>
+              <w:ind w:left="274"/>
               <w:rPr>
                 <w:sz w:val="18"/>
                 <w:szCs w:val="18"/>
@@ -606,7 +620,7 @@
         </w:tc>
         <w:tc>
           <w:tcPr>
-            <w:tcW w:w="6073" w:type="dxa"/>
+            <w:tcW w:w="5623" w:type="dxa"/>
             <w:tcMar>
               <w:top w:w="60" w:type="dxa"/>
               <w:left w:w="80" w:type="dxa"/>
@@ -634,7 +648,7 @@
       <w:tr>
         <w:tc>
           <w:tcPr>
-            <w:tcW w:w="2785" w:type="dxa"/>
+            <w:tcW w:w="3235" w:type="dxa"/>
             <w:tcMar>
               <w:top w:w="60" w:type="dxa"/>
               <w:left w:w="80" w:type="dxa"/>
@@ -644,6 +658,7 @@
           </w:tcPr>
           <w:p>
             <w:pPr>
+              <w:ind w:left="274"/>
               <w:rPr>
                 <w:sz w:val="18"/>
                 <w:szCs w:val="18"/>
@@ -687,7 +702,7 @@
         </w:tc>
         <w:tc>
           <w:tcPr>
-            <w:tcW w:w="6073" w:type="dxa"/>
+            <w:tcW w:w="5623" w:type="dxa"/>
             <w:tcMar>
               <w:top w:w="60" w:type="dxa"/>
               <w:left w:w="80" w:type="dxa"/>
@@ -715,7 +730,7 @@
       <w:tr>
         <w:tc>
           <w:tcPr>
-            <w:tcW w:w="2785" w:type="dxa"/>
+            <w:tcW w:w="3235" w:type="dxa"/>
             <w:tcMar>
               <w:top w:w="60" w:type="dxa"/>
               <w:left w:w="80" w:type="dxa"/>
@@ -725,6 +740,7 @@
           </w:tcPr>
           <w:p>
             <w:pPr>
+              <w:ind w:left="274"/>
               <w:rPr>
                 <w:sz w:val="18"/>
                 <w:szCs w:val="18"/>
@@ -768,7 +784,7 @@
         </w:tc>
         <w:tc>
           <w:tcPr>
-            <w:tcW w:w="6073" w:type="dxa"/>
+            <w:tcW w:w="5623" w:type="dxa"/>
             <w:tcMar>
               <w:top w:w="60" w:type="dxa"/>
               <w:left w:w="80" w:type="dxa"/>
@@ -796,7 +812,7 @@
       <w:tr>
         <w:tc>
           <w:tcPr>
-            <w:tcW w:w="2785" w:type="dxa"/>
+            <w:tcW w:w="3235" w:type="dxa"/>
             <w:tcMar>
               <w:top w:w="60" w:type="dxa"/>
               <w:left w:w="80" w:type="dxa"/>
@@ -806,6 +822,7 @@
           </w:tcPr>
           <w:p>
             <w:pPr>
+              <w:ind w:left="274"/>
               <w:rPr>
                 <w:sz w:val="18"/>
                 <w:szCs w:val="18"/>
@@ -867,7 +884,7 @@
         </w:tc>
         <w:tc>
           <w:tcPr>
-            <w:tcW w:w="6073" w:type="dxa"/>
+            <w:tcW w:w="5623" w:type="dxa"/>
             <w:tcMar>
               <w:top w:w="60" w:type="dxa"/>
               <w:left w:w="80" w:type="dxa"/>
@@ -904,7 +921,7 @@
       <w:tr>
         <w:tc>
           <w:tcPr>
-            <w:tcW w:w="2785" w:type="dxa"/>
+            <w:tcW w:w="3235" w:type="dxa"/>
             <w:tcMar>
               <w:top w:w="60" w:type="dxa"/>
               <w:left w:w="80" w:type="dxa"/>
@@ -914,6 +931,7 @@
           </w:tcPr>
           <w:p>
             <w:pPr>
+              <w:ind w:left="274"/>
               <w:rPr>
                 <w:sz w:val="18"/>
                 <w:szCs w:val="18"/>
@@ -957,7 +975,7 @@
         </w:tc>
         <w:tc>
           <w:tcPr>
-            <w:tcW w:w="6073" w:type="dxa"/>
+            <w:tcW w:w="5623" w:type="dxa"/>
             <w:tcMar>
               <w:top w:w="60" w:type="dxa"/>
               <w:left w:w="80" w:type="dxa"/>
@@ -994,7 +1012,7 @@
       <w:tr>
         <w:tc>
           <w:tcPr>
-            <w:tcW w:w="2785" w:type="dxa"/>
+            <w:tcW w:w="3235" w:type="dxa"/>
             <w:tcMar>
               <w:top w:w="60" w:type="dxa"/>
               <w:left w:w="80" w:type="dxa"/>
@@ -1004,6 +1022,7 @@
           </w:tcPr>
           <w:p>
             <w:pPr>
+              <w:ind w:left="274"/>
               <w:rPr>
                 <w:sz w:val="18"/>
                 <w:szCs w:val="18"/>
@@ -1047,7 +1066,7 @@
         </w:tc>
         <w:tc>
           <w:tcPr>
-            <w:tcW w:w="6073" w:type="dxa"/>
+            <w:tcW w:w="5623" w:type="dxa"/>
             <w:tcMar>
               <w:top w:w="60" w:type="dxa"/>
               <w:left w:w="80" w:type="dxa"/>
@@ -1075,7 +1094,7 @@
       <w:tr>
         <w:tc>
           <w:tcPr>
-            <w:tcW w:w="2785" w:type="dxa"/>
+            <w:tcW w:w="3235" w:type="dxa"/>
             <w:tcMar>
               <w:top w:w="60" w:type="dxa"/>
               <w:left w:w="80" w:type="dxa"/>
@@ -1085,6 +1104,7 @@
           </w:tcPr>
           <w:p>
             <w:pPr>
+              <w:ind w:left="274"/>
               <w:rPr>
                 <w:sz w:val="18"/>
                 <w:szCs w:val="18"/>
@@ -1137,7 +1157,7 @@
         </w:tc>
         <w:tc>
           <w:tcPr>
-            <w:tcW w:w="6073" w:type="dxa"/>
+            <w:tcW w:w="5623" w:type="dxa"/>
             <w:tcMar>
               <w:top w:w="60" w:type="dxa"/>
               <w:left w:w="80" w:type="dxa"/>
@@ -1165,7 +1185,7 @@
       <w:tr>
         <w:tc>
           <w:tcPr>
-            <w:tcW w:w="2785" w:type="dxa"/>
+            <w:tcW w:w="3235" w:type="dxa"/>
             <w:tcMar>
               <w:top w:w="60" w:type="dxa"/>
               <w:left w:w="80" w:type="dxa"/>
@@ -1175,6 +1195,7 @@
           </w:tcPr>
           <w:p>
             <w:pPr>
+              <w:ind w:left="274"/>
               <w:rPr>
                 <w:sz w:val="18"/>
                 <w:szCs w:val="18"/>
@@ -1218,7 +1239,7 @@
         </w:tc>
         <w:tc>
           <w:tcPr>
-            <w:tcW w:w="6073" w:type="dxa"/>
+            <w:tcW w:w="5623" w:type="dxa"/>
             <w:tcMar>
               <w:top w:w="60" w:type="dxa"/>
               <w:left w:w="80" w:type="dxa"/>
@@ -1252,6 +1273,7 @@
     <w:p>
       <w:pPr>
         <w:spacing w:line="276" w:lineRule="auto"/>
+        <w:ind w:left="360"/>
         <w:jc w:val="both"/>
         <w:rPr>
           <w:b/>
@@ -2465,59 +2487,6 @@
               </w:rPr>
               <w:t>Yang Menerima,</w:t>
             </w:r>
-          </w:p>
-        </w:tc>
-      </w:tr>
-      <w:tr>
-        <w:tc>
-          <w:tcPr>
-            <w:tcW w:w="3096" w:type="dxa"/>
-          </w:tcPr>
-          <w:p>
-            <w:pPr>
-              <w:pStyle w:val="ListParagraph"/>
-              <w:ind w:left="0"/>
-              <w:rPr>
-                <w:noProof/>
-                <w:sz w:val="18"/>
-                <w:szCs w:val="18"/>
-                <w:lang w:val="nb-NO"/>
-              </w:rPr>
-            </w:pPr>
-          </w:p>
-        </w:tc>
-        <w:tc>
-          <w:tcPr>
-            <w:tcW w:w="3087" w:type="dxa"/>
-          </w:tcPr>
-          <w:p>
-            <w:pPr>
-              <w:pStyle w:val="ListParagraph"/>
-              <w:ind w:left="0"/>
-              <w:rPr>
-                <w:noProof/>
-                <w:sz w:val="18"/>
-                <w:szCs w:val="18"/>
-                <w:lang w:val="nb-NO"/>
-              </w:rPr>
-            </w:pPr>
-          </w:p>
-        </w:tc>
-        <w:tc>
-          <w:tcPr>
-            <w:tcW w:w="3085" w:type="dxa"/>
-          </w:tcPr>
-          <w:p>
-            <w:pPr>
-              <w:pStyle w:val="ListParagraph"/>
-              <w:ind w:left="0"/>
-              <w:rPr>
-                <w:noProof/>
-                <w:sz w:val="18"/>
-                <w:szCs w:val="18"/>
-                <w:lang w:val="nb-NO"/>
-              </w:rPr>
-            </w:pPr>
           </w:p>
         </w:tc>
       </w:tr>

</xml_diff>

<commit_message>
fix: ukuran kolom di header
</commit_message>
<xml_diff>
--- a/Berita Acara Alokasi_fix.docx
+++ b/Berita Acara Alokasi_fix.docx
@@ -247,14 +247,14 @@
               <w:tblLook w:val="04A0" w:firstRow="1" w:lastRow="0" w:firstColumn="1" w:lastColumn="0" w:noHBand="0" w:noVBand="1"/>
             </w:tblPr>
             <w:tblGrid>
-              <w:gridCol w:w="1466"/>
+              <w:gridCol w:w="885"/>
               <w:gridCol w:w="272"/>
-              <w:gridCol w:w="2719"/>
+              <w:gridCol w:w="3300"/>
             </w:tblGrid>
             <w:tr>
               <w:tc>
                 <w:tcPr>
-                  <w:tcW w:w="1485" w:type="dxa"/>
+                  <w:tcW w:w="885" w:type="dxa"/>
                 </w:tcPr>
                 <w:p>
                   <w:pPr>
@@ -276,7 +276,7 @@
               </w:tc>
               <w:tc>
                 <w:tcPr>
-                  <w:tcW w:w="236" w:type="dxa"/>
+                  <w:tcW w:w="270" w:type="dxa"/>
                 </w:tcPr>
                 <w:p>
                   <w:pPr>
@@ -294,7 +294,7 @@
               </w:tc>
               <w:tc>
                 <w:tcPr>
-                  <w:tcW w:w="2736" w:type="dxa"/>
+                  <w:tcW w:w="3302" w:type="dxa"/>
                 </w:tcPr>
                 <w:p>
                   <w:pPr>
@@ -318,7 +318,7 @@
             <w:tr>
               <w:tc>
                 <w:tcPr>
-                  <w:tcW w:w="1485" w:type="dxa"/>
+                  <w:tcW w:w="885" w:type="dxa"/>
                 </w:tcPr>
                 <w:p>
                   <w:pPr>
@@ -340,7 +340,7 @@
               </w:tc>
               <w:tc>
                 <w:tcPr>
-                  <w:tcW w:w="236" w:type="dxa"/>
+                  <w:tcW w:w="270" w:type="dxa"/>
                 </w:tcPr>
                 <w:p>
                   <w:pPr>
@@ -358,7 +358,7 @@
               </w:tc>
               <w:tc>
                 <w:tcPr>
-                  <w:tcW w:w="2736" w:type="dxa"/>
+                  <w:tcW w:w="3302" w:type="dxa"/>
                 </w:tcPr>
                 <w:p>
                   <w:pPr>
@@ -382,7 +382,7 @@
             <w:tr>
               <w:tc>
                 <w:tcPr>
-                  <w:tcW w:w="1485" w:type="dxa"/>
+                  <w:tcW w:w="885" w:type="dxa"/>
                 </w:tcPr>
                 <w:p>
                   <w:pPr>
@@ -404,7 +404,7 @@
               </w:tc>
               <w:tc>
                 <w:tcPr>
-                  <w:tcW w:w="236" w:type="dxa"/>
+                  <w:tcW w:w="270" w:type="dxa"/>
                 </w:tcPr>
                 <w:p>
                   <w:pPr>
@@ -422,7 +422,7 @@
               </w:tc>
               <w:tc>
                 <w:tcPr>
-                  <w:tcW w:w="2736" w:type="dxa"/>
+                  <w:tcW w:w="3302" w:type="dxa"/>
                 </w:tcPr>
                 <w:p>
                   <w:pPr>
@@ -446,7 +446,7 @@
             <w:tr>
               <w:tc>
                 <w:tcPr>
-                  <w:tcW w:w="1485" w:type="dxa"/>
+                  <w:tcW w:w="885" w:type="dxa"/>
                 </w:tcPr>
                 <w:p>
                   <w:pPr>
@@ -468,7 +468,7 @@
               </w:tc>
               <w:tc>
                 <w:tcPr>
-                  <w:tcW w:w="236" w:type="dxa"/>
+                  <w:tcW w:w="270" w:type="dxa"/>
                 </w:tcPr>
                 <w:p>
                   <w:pPr>
@@ -486,7 +486,7 @@
               </w:tc>
               <w:tc>
                 <w:tcPr>
-                  <w:tcW w:w="2736" w:type="dxa"/>
+                  <w:tcW w:w="3302" w:type="dxa"/>
                 </w:tcPr>
                 <w:p>
                   <w:pPr>

</xml_diff>